<commit_message>
Agrega diagnostico y ubicacion exacta a cada bloque de verificacion de codigo
En PB1-PB7 (Seccion 4) se agregan dos campos por bloque: que esta mal (en
palabras del estudiante) y la ubicacion exacta archivo:linea del error,
usando el numero de linea que ya devuelve el comando de cada bloque.

Co-Authored-By: Claude Sonnet 5 <noreply@anthropic.com>
Claude-Session: https://claude.ai/code/session_01TTepGRhLskzGbvCLqhHRgM
</commit_message>
<xml_diff>
--- a/docs/FICHA_DIAGNOSTICO_ISO25010_MINIHOTEL.docx
+++ b/docs/FICHA_DIAGNOSTICO_ISO25010_MINIHOTEL.docx
@@ -11342,6 +11342,52 @@
           <w:b/>
           <w:bCs/>
         </w:rPr>
+        <w:t xml:space="preserve">🔎 ¿Qué está mal? (explícalo en tus palabras, 1 línea)</w:t>
+      </w:r>
+    </w:p>
+    <w:p>
+      <w:pPr>
+        <w:pStyle w:val="BodyText"/>
+      </w:pPr>
+      <w:r>
+        <w:rPr>
+          <w:highlight w:val="yellow"/>
+        </w:rPr>
+        <w:t xml:space="preserve">__________________________________________________________________</w:t>
+      </w:r>
+    </w:p>
+    <w:p>
+      <w:pPr>
+        <w:pStyle w:val="BodyText"/>
+      </w:pPr>
+      <w:r>
+        <w:rPr>
+          <w:b/>
+          <w:bCs/>
+        </w:rPr>
+        <w:t xml:space="preserve">📍 Ubicación exacta del error — archivo : línea (usa el número que te dio el comando)</w:t>
+      </w:r>
+    </w:p>
+    <w:p>
+      <w:pPr>
+        <w:pStyle w:val="BodyText"/>
+      </w:pPr>
+      <w:r>
+        <w:rPr>
+          <w:highlight w:val="yellow"/>
+        </w:rPr>
+        <w:t xml:space="preserve">__________________________________________________________________</w:t>
+      </w:r>
+    </w:p>
+    <w:p>
+      <w:pPr>
+        <w:pStyle w:val="BodyText"/>
+      </w:pPr>
+      <w:r>
+        <w:rPr>
+          <w:b/>
+          <w:bCs/>
+        </w:rPr>
         <w:t xml:space="preserve">✍️ ¿Qué operación usa (resta o multiplicación)? Copia la línea exacta.</w:t>
       </w:r>
       <w:r>
@@ -11580,6 +11626,52 @@
           <w:b/>
           <w:bCs/>
         </w:rPr>
+        <w:t xml:space="preserve">🔎 ¿Qué está mal? (explícalo en tus palabras, 1 línea)</w:t>
+      </w:r>
+    </w:p>
+    <w:p>
+      <w:pPr>
+        <w:pStyle w:val="BodyText"/>
+      </w:pPr>
+      <w:r>
+        <w:rPr>
+          <w:highlight w:val="yellow"/>
+        </w:rPr>
+        <w:t xml:space="preserve">__________________________________________________________________</w:t>
+      </w:r>
+    </w:p>
+    <w:p>
+      <w:pPr>
+        <w:pStyle w:val="BodyText"/>
+      </w:pPr>
+      <w:r>
+        <w:rPr>
+          <w:b/>
+          <w:bCs/>
+        </w:rPr>
+        <w:t xml:space="preserve">📍 Ubicación exacta del error — archivo : línea (usa el número que te dio el comando)</w:t>
+      </w:r>
+    </w:p>
+    <w:p>
+      <w:pPr>
+        <w:pStyle w:val="BodyText"/>
+      </w:pPr>
+      <w:r>
+        <w:rPr>
+          <w:highlight w:val="yellow"/>
+        </w:rPr>
+        <w:t xml:space="preserve">__________________________________________________________________</w:t>
+      </w:r>
+    </w:p>
+    <w:p>
+      <w:pPr>
+        <w:pStyle w:val="BodyText"/>
+      </w:pPr>
+      <w:r>
+        <w:rPr>
+          <w:b/>
+          <w:bCs/>
+        </w:rPr>
         <w:t xml:space="preserve">✍️ ¿Cuántas veces se valida</w:t>
       </w:r>
       <w:r>
@@ -11819,6 +11911,52 @@
           <w:b/>
           <w:bCs/>
         </w:rPr>
+        <w:t xml:space="preserve">🔎 ¿Qué está mal? (explícalo en tus palabras, 1 línea)</w:t>
+      </w:r>
+    </w:p>
+    <w:p>
+      <w:pPr>
+        <w:pStyle w:val="BodyText"/>
+      </w:pPr>
+      <w:r>
+        <w:rPr>
+          <w:highlight w:val="yellow"/>
+        </w:rPr>
+        <w:t xml:space="preserve">__________________________________________________________________</w:t>
+      </w:r>
+    </w:p>
+    <w:p>
+      <w:pPr>
+        <w:pStyle w:val="BodyText"/>
+      </w:pPr>
+      <w:r>
+        <w:rPr>
+          <w:b/>
+          <w:bCs/>
+        </w:rPr>
+        <w:t xml:space="preserve">📍 Ubicación exacta del error — archivo : línea (usa el número que te dio el comando)</w:t>
+      </w:r>
+    </w:p>
+    <w:p>
+      <w:pPr>
+        <w:pStyle w:val="BodyText"/>
+      </w:pPr>
+      <w:r>
+        <w:rPr>
+          <w:highlight w:val="yellow"/>
+        </w:rPr>
+        <w:t xml:space="preserve">__________________________________________________________________</w:t>
+      </w:r>
+    </w:p>
+    <w:p>
+      <w:pPr>
+        <w:pStyle w:val="BodyText"/>
+      </w:pPr>
+      <w:r>
+        <w:rPr>
+          <w:b/>
+          <w:bCs/>
+        </w:rPr>
         <w:t xml:space="preserve">✍️ Dentro de ese método, ¿hay alguna línea que ponga</w:t>
       </w:r>
       <w:r>
@@ -12054,6 +12192,52 @@
           <w:b/>
           <w:bCs/>
         </w:rPr>
+        <w:t xml:space="preserve">🔎 ¿Qué está mal? (explícalo en tus palabras, 1 línea)</w:t>
+      </w:r>
+    </w:p>
+    <w:p>
+      <w:pPr>
+        <w:pStyle w:val="BodyText"/>
+      </w:pPr>
+      <w:r>
+        <w:rPr>
+          <w:highlight w:val="yellow"/>
+        </w:rPr>
+        <w:t xml:space="preserve">__________________________________________________________________</w:t>
+      </w:r>
+    </w:p>
+    <w:p>
+      <w:pPr>
+        <w:pStyle w:val="BodyText"/>
+      </w:pPr>
+      <w:r>
+        <w:rPr>
+          <w:b/>
+          <w:bCs/>
+        </w:rPr>
+        <w:t xml:space="preserve">📍 Ubicación exacta del error — archivo : línea (usa el número que te dio el comando)</w:t>
+      </w:r>
+    </w:p>
+    <w:p>
+      <w:pPr>
+        <w:pStyle w:val="BodyText"/>
+      </w:pPr>
+      <w:r>
+        <w:rPr>
+          <w:highlight w:val="yellow"/>
+        </w:rPr>
+        <w:t xml:space="preserve">__________________________________________________________________</w:t>
+      </w:r>
+    </w:p>
+    <w:p>
+      <w:pPr>
+        <w:pStyle w:val="BodyText"/>
+      </w:pPr>
+      <w:r>
+        <w:rPr>
+          <w:b/>
+          <w:bCs/>
+        </w:rPr>
         <w:t xml:space="preserve">✍️ Copia la línea exacta. ¿Usa el precio CON o SIN descuento?</w:t>
       </w:r>
       <w:r>
@@ -12252,6 +12436,52 @@
           <w:b/>
           <w:bCs/>
         </w:rPr>
+        <w:t xml:space="preserve">🔎 ¿Qué está mal? (explícalo en tus palabras, 1 línea)</w:t>
+      </w:r>
+    </w:p>
+    <w:p>
+      <w:pPr>
+        <w:pStyle w:val="BodyText"/>
+      </w:pPr>
+      <w:r>
+        <w:rPr>
+          <w:highlight w:val="yellow"/>
+        </w:rPr>
+        <w:t xml:space="preserve">__________________________________________________________________</w:t>
+      </w:r>
+    </w:p>
+    <w:p>
+      <w:pPr>
+        <w:pStyle w:val="BodyText"/>
+      </w:pPr>
+      <w:r>
+        <w:rPr>
+          <w:b/>
+          <w:bCs/>
+        </w:rPr>
+        <w:t xml:space="preserve">📍 Ubicación exacta del error — archivo : línea (usa el número que te dio el comando)</w:t>
+      </w:r>
+    </w:p>
+    <w:p>
+      <w:pPr>
+        <w:pStyle w:val="BodyText"/>
+      </w:pPr>
+      <w:r>
+        <w:rPr>
+          <w:highlight w:val="yellow"/>
+        </w:rPr>
+        <w:t xml:space="preserve">__________________________________________________________________</w:t>
+      </w:r>
+    </w:p>
+    <w:p>
+      <w:pPr>
+        <w:pStyle w:val="BodyText"/>
+      </w:pPr>
+      <w:r>
+        <w:rPr>
+          <w:b/>
+          <w:bCs/>
+        </w:rPr>
         <w:t xml:space="preserve">✍️ Copia la ruta exacta que encontraste escrita en el código.</w:t>
       </w:r>
       <w:r>
@@ -12450,6 +12680,52 @@
           <w:b/>
           <w:bCs/>
         </w:rPr>
+        <w:t xml:space="preserve">🔎 ¿Qué está mal? (explícalo en tus palabras, 1 línea)</w:t>
+      </w:r>
+    </w:p>
+    <w:p>
+      <w:pPr>
+        <w:pStyle w:val="BodyText"/>
+      </w:pPr>
+      <w:r>
+        <w:rPr>
+          <w:highlight w:val="yellow"/>
+        </w:rPr>
+        <w:t xml:space="preserve">__________________________________________________________________</w:t>
+      </w:r>
+    </w:p>
+    <w:p>
+      <w:pPr>
+        <w:pStyle w:val="BodyText"/>
+      </w:pPr>
+      <w:r>
+        <w:rPr>
+          <w:b/>
+          <w:bCs/>
+        </w:rPr>
+        <w:t xml:space="preserve">📍 Ubicación exacta del error — archivo : línea (usa el número que te dio el comando)</w:t>
+      </w:r>
+    </w:p>
+    <w:p>
+      <w:pPr>
+        <w:pStyle w:val="BodyText"/>
+      </w:pPr>
+      <w:r>
+        <w:rPr>
+          <w:highlight w:val="yellow"/>
+        </w:rPr>
+        <w:t xml:space="preserve">__________________________________________________________________</w:t>
+      </w:r>
+    </w:p>
+    <w:p>
+      <w:pPr>
+        <w:pStyle w:val="BodyText"/>
+      </w:pPr>
+      <w:r>
+        <w:rPr>
+          <w:b/>
+          <w:bCs/>
+        </w:rPr>
         <w:t xml:space="preserve">✍️ ¿Cuántos segundos espera esa línea a propósito?</w:t>
       </w:r>
       <w:r>
@@ -12661,6 +12937,63 @@
         </w:tc>
       </w:tr>
     </w:tbl>
+    <w:p>
+      <w:pPr>
+        <w:pStyle w:val="BodyText"/>
+      </w:pPr>
+      <w:r>
+        <w:rPr>
+          <w:b/>
+          <w:bCs/>
+        </w:rPr>
+        <w:t xml:space="preserve">🔎 ¿Qué está mal? (explícalo en tus palabras, 1 línea)</w:t>
+      </w:r>
+    </w:p>
+    <w:p>
+      <w:pPr>
+        <w:pStyle w:val="BodyText"/>
+      </w:pPr>
+      <w:r>
+        <w:rPr>
+          <w:highlight w:val="yellow"/>
+        </w:rPr>
+        <w:t xml:space="preserve">__________________________________________________________________</w:t>
+      </w:r>
+    </w:p>
+    <w:p>
+      <w:pPr>
+        <w:pStyle w:val="BodyText"/>
+      </w:pPr>
+      <w:r>
+        <w:rPr>
+          <w:b/>
+          <w:bCs/>
+        </w:rPr>
+        <w:t xml:space="preserve">📍 Ubicaciones exactas — archivo : línea de CADA forma distinta que encontraste</w:t>
+      </w:r>
+    </w:p>
+    <w:p>
+      <w:pPr>
+        <w:pStyle w:val="BodyText"/>
+      </w:pPr>
+      <w:r>
+        <w:rPr>
+          <w:highlight w:val="yellow"/>
+        </w:rPr>
+        <w:t xml:space="preserve">__________________________________________________________________</w:t>
+      </w:r>
+    </w:p>
+    <w:p>
+      <w:pPr>
+        <w:pStyle w:val="BodyText"/>
+      </w:pPr>
+      <w:r>
+        <w:rPr>
+          <w:highlight w:val="yellow"/>
+        </w:rPr>
+        <w:t xml:space="preserve">__________________________________________________________________</w:t>
+      </w:r>
+    </w:p>
     <w:p>
       <w:pPr>
         <w:pStyle w:val="BodyText"/>

</xml_diff>

<commit_message>
Agrega guia de busqueda (Ctrl+F y numero de linea) para principiantes
La Seccion 1 ahora explica paso a paso como buscar una palabra dentro de
un archivo con Ctrl+F en VS Code/Notepad++ (y por que evitar el Bloc de
notas, que no numera lineas), y como leer el numero de linea que ya
imprimen los comandos grep/Select-String. Se referencia desde la Seccion 4
para que sepan como llenar "Ubicacion exacta del error".

Co-Authored-By: Claude Sonnet 5 <noreply@anthropic.com>
Claude-Session: https://claude.ai/code/session_01TTepGRhLskzGbvCLqhHRgM
</commit_message>
<xml_diff>
--- a/docs/FICHA_DIAGNOSTICO_ISO25010_MINIHOTEL.docx
+++ b/docs/FICHA_DIAGNOSTICO_ISO25010_MINIHOTEL.docx
@@ -2,7 +2,7 @@
 <file path=word/document.xml><?xml version="1.0" encoding="utf-8"?>
 <w:document xmlns:w="http://schemas.openxmlformats.org/wordprocessingml/2006/main" xmlns:m="http://schemas.openxmlformats.org/officeDocument/2006/math" xmlns:r="http://schemas.openxmlformats.org/officeDocument/2006/relationships" xmlns:o="urn:schemas-microsoft-com:office:office" xmlns:v="urn:schemas-microsoft-com:vml" xmlns:w10="urn:schemas-microsoft-com:office:word" xmlns:a="http://schemas.openxmlformats.org/drawingml/2006/main" xmlns:pic="http://schemas.openxmlformats.org/drawingml/2006/picture" xmlns:wp="http://schemas.openxmlformats.org/drawingml/2006/wordprocessingDrawing">
   <w:body>
-    <w:bookmarkStart w:id="54" w:name="Xff716e0b519f3dbe7853011ad85dfeb49943812"/>
+    <w:bookmarkStart w:id="55" w:name="Xff716e0b519f3dbe7853011ad85dfeb49943812"/>
     <w:p>
       <w:pPr>
         <w:pStyle w:val="Heading1"/>
@@ -854,7 +854,7 @@
       </w:r>
     </w:p>
     <w:bookmarkEnd w:id="11"/>
-    <w:bookmarkStart w:id="16" w:name="Xb1cf23ed07a77d6775b34fe11a983fd44f01da8"/>
+    <w:bookmarkStart w:id="17" w:name="Xb1cf23ed07a77d6775b34fe11a983fd44f01da8"/>
     <w:p>
       <w:pPr>
         <w:pStyle w:val="Heading2"/>
@@ -1115,12 +1115,389 @@
         </w:tc>
       </w:tr>
     </w:tbl>
-    <w:p>
-      <w:pPr>
-        <w:pStyle w:val="BodyText"/>
-      </w:pPr>
-      <w:r>
-        <w:t xml:space="preserve">Abre cada archivo con el Bloc de notas, VS Code o Notepad++ (no hace falta un IDE) y sigue los pasos.</w:t>
+    <w:bookmarkStart w:id="12" w:name="Xa0b402b58b6d5be788abec5e5d06ac7b96bd0ba"/>
+    <w:p>
+      <w:pPr>
+        <w:pStyle w:val="Heading3"/>
+      </w:pPr>
+      <w:r>
+        <w:t xml:space="preserve">🔎 Cómo buscar dentro del código (léelo antes de CR1 — se usa en toda la ficha)</w:t>
+      </w:r>
+    </w:p>
+    <w:p>
+      <w:pPr>
+        <w:pStyle w:val="FirstParagraph"/>
+      </w:pPr>
+      <w:r>
+        <w:t xml:space="preserve">Nunca vas a leer un archivo completo de arriba a abajo:</w:t>
+      </w:r>
+      <w:r>
+        <w:t xml:space="preserve"> </w:t>
+      </w:r>
+      <w:r>
+        <w:rPr>
+          <w:b/>
+          <w:bCs/>
+        </w:rPr>
+        <w:t xml:space="preserve">buscas una palabra puntual</w:t>
+      </w:r>
+      <w:r>
+        <w:t xml:space="preserve"> </w:t>
+      </w:r>
+      <w:r>
+        <w:t xml:space="preserve">y miras solo alrededor. Dos formas, usa la que te sea más cómoda:</w:t>
+      </w:r>
+    </w:p>
+    <w:p>
+      <w:pPr>
+        <w:pStyle w:val="BodyText"/>
+      </w:pPr>
+      <w:r>
+        <w:rPr>
+          <w:b/>
+          <w:bCs/>
+        </w:rPr>
+        <w:t xml:space="preserve">Opción A — con el editor (Ctrl+F):</w:t>
+      </w:r>
+    </w:p>
+    <w:p>
+      <w:pPr>
+        <w:pStyle w:val="Compact"/>
+        <w:numPr>
+          <w:ilvl w:val="0"/>
+          <w:numId w:val="1001"/>
+        </w:numPr>
+      </w:pPr>
+      <w:r>
+        <w:t xml:space="preserve">Abre el archivo con</w:t>
+      </w:r>
+      <w:r>
+        <w:t xml:space="preserve"> </w:t>
+      </w:r>
+      <w:r>
+        <w:rPr>
+          <w:b/>
+          <w:bCs/>
+        </w:rPr>
+        <w:t xml:space="preserve">VS Code</w:t>
+      </w:r>
+      <w:r>
+        <w:t xml:space="preserve"> </w:t>
+      </w:r>
+      <w:r>
+        <w:t xml:space="preserve">o</w:t>
+      </w:r>
+      <w:r>
+        <w:t xml:space="preserve"> </w:t>
+      </w:r>
+      <w:r>
+        <w:rPr>
+          <w:b/>
+          <w:bCs/>
+        </w:rPr>
+        <w:t xml:space="preserve">Notepad++</w:t>
+      </w:r>
+      <w:r>
+        <w:t xml:space="preserve"> </w:t>
+      </w:r>
+      <w:r>
+        <w:t xml:space="preserve">(no hace falta instalar nada más pesado). Evita el Bloc de notas de Windows: no muestra número de línea, y lo vas a necesitar.</w:t>
+      </w:r>
+    </w:p>
+    <w:p>
+      <w:pPr>
+        <w:pStyle w:val="Compact"/>
+        <w:numPr>
+          <w:ilvl w:val="0"/>
+          <w:numId w:val="1001"/>
+        </w:numPr>
+      </w:pPr>
+      <w:r>
+        <w:t xml:space="preserve">Con el archivo abierto, presiona</w:t>
+      </w:r>
+      <w:r>
+        <w:t xml:space="preserve"> </w:t>
+      </w:r>
+      <w:r>
+        <w:rPr>
+          <w:b/>
+          <w:bCs/>
+        </w:rPr>
+        <w:t xml:space="preserve">Ctrl+F</w:t>
+      </w:r>
+      <w:r>
+        <w:t xml:space="preserve">. Aparece un cuadro de búsqueda arriba o al costado.</w:t>
+      </w:r>
+    </w:p>
+    <w:p>
+      <w:pPr>
+        <w:pStyle w:val="Compact"/>
+        <w:numPr>
+          <w:ilvl w:val="0"/>
+          <w:numId w:val="1001"/>
+        </w:numPr>
+      </w:pPr>
+      <w:r>
+        <w:t xml:space="preserve">Escribe</w:t>
+      </w:r>
+      <w:r>
+        <w:t xml:space="preserve"> </w:t>
+      </w:r>
+      <w:r>
+        <w:rPr>
+          <w:b/>
+          <w:bCs/>
+        </w:rPr>
+        <w:t xml:space="preserve">exactamente</w:t>
+      </w:r>
+      <w:r>
+        <w:t xml:space="preserve"> </w:t>
+      </w:r>
+      <w:r>
+        <w:t xml:space="preserve">la palabra que se te pide en cada bloque (por ejemplo</w:t>
+      </w:r>
+      <w:r>
+        <w:t xml:space="preserve"> </w:t>
+      </w:r>
+      <w:r>
+        <w:rPr>
+          <w:rStyle w:val="VerbatimChar"/>
+        </w:rPr>
+        <w:t xml:space="preserve">def cancelar</w:t>
+      </w:r>
+      <w:r>
+        <w:t xml:space="preserve">), tal cual, sin comillas.</w:t>
+      </w:r>
+    </w:p>
+    <w:p>
+      <w:pPr>
+        <w:pStyle w:val="Compact"/>
+        <w:numPr>
+          <w:ilvl w:val="0"/>
+          <w:numId w:val="1001"/>
+        </w:numPr>
+      </w:pPr>
+      <w:r>
+        <w:t xml:space="preserve">Presiona</w:t>
+      </w:r>
+      <w:r>
+        <w:t xml:space="preserve"> </w:t>
+      </w:r>
+      <w:r>
+        <w:rPr>
+          <w:b/>
+          <w:bCs/>
+        </w:rPr>
+        <w:t xml:space="preserve">Enter</w:t>
+      </w:r>
+      <w:r>
+        <w:t xml:space="preserve">. El editor salta a la primera coincidencia y la resalta en amarillo/verde.</w:t>
+      </w:r>
+    </w:p>
+    <w:p>
+      <w:pPr>
+        <w:pStyle w:val="Compact"/>
+        <w:numPr>
+          <w:ilvl w:val="0"/>
+          <w:numId w:val="1001"/>
+        </w:numPr>
+      </w:pPr>
+      <w:r>
+        <w:t xml:space="preserve">Mira el número de línea: en VS Code aparece abajo a la derecha (</w:t>
+      </w:r>
+      <w:r>
+        <w:t xml:space="preserve">“Ln 131, Col 5”</w:t>
+      </w:r>
+      <w:r>
+        <w:t xml:space="preserve">); en Notepad++ aparece en la columna gris de la izquierda. Ese número es el que escribes en</w:t>
+      </w:r>
+      <w:r>
+        <w:t xml:space="preserve"> </w:t>
+      </w:r>
+      <w:r>
+        <w:t xml:space="preserve">“Ubicación exacta”</w:t>
+      </w:r>
+      <w:r>
+        <w:t xml:space="preserve">.</w:t>
+      </w:r>
+    </w:p>
+    <w:p>
+      <w:pPr>
+        <w:pStyle w:val="FirstParagraph"/>
+      </w:pPr>
+      <w:r>
+        <w:rPr>
+          <w:b/>
+          <w:bCs/>
+        </w:rPr>
+        <w:t xml:space="preserve">Opción B — con el comando de la terminal (más rápido, y ya lo tienes):</w:t>
+      </w:r>
+    </w:p>
+    <w:p>
+      <w:pPr>
+        <w:pStyle w:val="BodyText"/>
+      </w:pPr>
+      <w:r>
+        <w:t xml:space="preserve">Los comandos</w:t>
+      </w:r>
+      <w:r>
+        <w:t xml:space="preserve"> </w:t>
+      </w:r>
+      <w:r>
+        <w:rPr>
+          <w:rStyle w:val="VerbatimChar"/>
+        </w:rPr>
+        <w:t xml:space="preserve">grep -n</w:t>
+      </w:r>
+      <w:r>
+        <w:t xml:space="preserve"> </w:t>
+      </w:r>
+      <w:r>
+        <w:t xml:space="preserve">/</w:t>
+      </w:r>
+      <w:r>
+        <w:t xml:space="preserve"> </w:t>
+      </w:r>
+      <w:r>
+        <w:rPr>
+          <w:rStyle w:val="VerbatimChar"/>
+        </w:rPr>
+        <w:t xml:space="preserve">Select-String</w:t>
+      </w:r>
+      <w:r>
+        <w:t xml:space="preserve"> </w:t>
+      </w:r>
+      <w:r>
+        <w:t xml:space="preserve">que se dan en cada bloque</w:t>
+      </w:r>
+      <w:r>
+        <w:t xml:space="preserve"> </w:t>
+      </w:r>
+      <w:r>
+        <w:rPr>
+          <w:b/>
+          <w:bCs/>
+        </w:rPr>
+        <w:t xml:space="preserve">ya imprimen el número de línea</w:t>
+      </w:r>
+      <w:r>
+        <w:t xml:space="preserve"> </w:t>
+      </w:r>
+      <w:r>
+        <w:t xml:space="preserve">al inicio de cada resultado. Por ejemplo, si el resultado dice:</w:t>
+      </w:r>
+    </w:p>
+    <w:p>
+      <w:pPr>
+        <w:pStyle w:val="SourceCode"/>
+      </w:pPr>
+      <w:r>
+        <w:rPr>
+          <w:rStyle w:val="VerbatimChar"/>
+        </w:rPr>
+        <w:t xml:space="preserve">131:    def cancelar(self, codigo):</w:t>
+      </w:r>
+    </w:p>
+    <w:p>
+      <w:pPr>
+        <w:pStyle w:val="FirstParagraph"/>
+      </w:pPr>
+      <w:r>
+        <w:t xml:space="preserve">el</w:t>
+      </w:r>
+      <w:r>
+        <w:t xml:space="preserve"> </w:t>
+      </w:r>
+      <w:r>
+        <w:rPr>
+          <w:rStyle w:val="VerbatimChar"/>
+        </w:rPr>
+        <w:t xml:space="preserve">131</w:t>
+      </w:r>
+      <w:r>
+        <w:t xml:space="preserve"> </w:t>
+      </w:r>
+      <w:r>
+        <w:t xml:space="preserve">de antes de los dos puntos</w:t>
+      </w:r>
+      <w:r>
+        <w:t xml:space="preserve"> </w:t>
+      </w:r>
+      <w:r>
+        <w:rPr>
+          <w:b/>
+          <w:bCs/>
+        </w:rPr>
+        <w:t xml:space="preserve">es el número de línea</w:t>
+      </w:r>
+      <w:r>
+        <w:t xml:space="preserve">. No necesitas abrir el editor para esto — solo para leer más contexto alrededor si te hace falta.</w:t>
+      </w:r>
+    </w:p>
+    <w:p>
+      <w:pPr>
+        <w:pStyle w:val="BodyText"/>
+      </w:pPr>
+      <w:r>
+        <w:rPr>
+          <w:b/>
+          <w:bCs/>
+        </w:rPr>
+        <w:t xml:space="preserve">Para la</w:t>
+      </w:r>
+      <w:r>
+        <w:rPr>
+          <w:b/>
+          <w:bCs/>
+        </w:rPr>
+        <w:t xml:space="preserve"> </w:t>
+      </w:r>
+      <w:r>
+        <w:rPr>
+          <w:b/>
+          <w:bCs/>
+        </w:rPr>
+        <w:t xml:space="preserve">“Ubicación exacta del error”</w:t>
+      </w:r>
+      <w:r>
+        <w:rPr>
+          <w:b/>
+          <w:bCs/>
+        </w:rPr>
+        <w:t xml:space="preserve">:</w:t>
+      </w:r>
+      <w:r>
+        <w:t xml:space="preserve"> </w:t>
+      </w:r>
+      <w:r>
+        <w:t xml:space="preserve">escribe</w:t>
+      </w:r>
+      <w:r>
+        <w:t xml:space="preserve"> </w:t>
+      </w:r>
+      <w:r>
+        <w:rPr>
+          <w:rStyle w:val="VerbatimChar"/>
+        </w:rPr>
+        <w:t xml:space="preserve">archivo.py:número</w:t>
+      </w:r>
+      <w:r>
+        <w:t xml:space="preserve"> </w:t>
+      </w:r>
+      <w:r>
+        <w:t xml:space="preserve">(por ejemplo</w:t>
+      </w:r>
+      <w:r>
+        <w:t xml:space="preserve"> </w:t>
+      </w:r>
+      <w:r>
+        <w:rPr>
+          <w:rStyle w:val="VerbatimChar"/>
+        </w:rPr>
+        <w:t xml:space="preserve">hotel.py:131</w:t>
+      </w:r>
+      <w:r>
+        <w:t xml:space="preserve">), usando cualquiera de las dos opciones de arriba.</w:t>
       </w:r>
     </w:p>
     <w:p>
@@ -1130,7 +1507,8 @@
         </w:pict>
       </w:r>
     </w:p>
-    <w:bookmarkStart w:id="12" w:name="X62fce42df95ba873bd7f9f7fbed3719fb91759e"/>
+    <w:bookmarkEnd w:id="12"/>
+    <w:bookmarkStart w:id="13" w:name="X62fce42df95ba873bd7f9f7fbed3719fb91759e"/>
     <w:p>
       <w:pPr>
         <w:pStyle w:val="Heading3"/>
@@ -1320,8 +1698,8 @@
         </w:pict>
       </w:r>
     </w:p>
-    <w:bookmarkEnd w:id="12"/>
-    <w:bookmarkStart w:id="13" w:name="cr2-encuentra-el-punto-de-entrada"/>
+    <w:bookmarkEnd w:id="13"/>
+    <w:bookmarkStart w:id="14" w:name="cr2-encuentra-el-punto-de-entrada"/>
     <w:p>
       <w:pPr>
         <w:pStyle w:val="Heading3"/>
@@ -1436,8 +1814,8 @@
         </w:pict>
       </w:r>
     </w:p>
-    <w:bookmarkEnd w:id="13"/>
-    <w:bookmarkStart w:id="14" w:name="Xd7f26868b13d923a7b7634524cfa167bf6c5637"/>
+    <w:bookmarkEnd w:id="14"/>
+    <w:bookmarkStart w:id="15" w:name="Xd7f26868b13d923a7b7634524cfa167bf6c5637"/>
     <w:p>
       <w:pPr>
         <w:pStyle w:val="Heading3"/>
@@ -1714,8 +2092,8 @@
         </w:pict>
       </w:r>
     </w:p>
-    <w:bookmarkEnd w:id="14"/>
-    <w:bookmarkStart w:id="15" w:name="X2e635557ef1c4fb3b9af54cf4ae1ee6ffee86f8"/>
+    <w:bookmarkEnd w:id="15"/>
+    <w:bookmarkStart w:id="16" w:name="X2e635557ef1c4fb3b9af54cf4ae1ee6ffee86f8"/>
     <w:p>
       <w:pPr>
         <w:pStyle w:val="Heading3"/>
@@ -1961,9 +2339,9 @@
         </w:pict>
       </w:r>
     </w:p>
-    <w:bookmarkEnd w:id="15"/>
     <w:bookmarkEnd w:id="16"/>
-    <w:bookmarkStart w:id="17" w:name="sección-2-arranque-del-sistema"/>
+    <w:bookmarkEnd w:id="17"/>
+    <w:bookmarkStart w:id="18" w:name="sección-2-arranque-del-sistema"/>
     <w:p>
       <w:pPr>
         <w:pStyle w:val="Heading2"/>
@@ -1989,7 +2367,7 @@
         <w:pStyle w:val="Compact"/>
         <w:numPr>
           <w:ilvl w:val="0"/>
-          <w:numId w:val="1001"/>
+          <w:numId w:val="1002"/>
         </w:numPr>
       </w:pPr>
       <w:r>
@@ -2001,7 +2379,7 @@
         <w:pStyle w:val="Compact"/>
         <w:numPr>
           <w:ilvl w:val="0"/>
-          <w:numId w:val="1001"/>
+          <w:numId w:val="1002"/>
         </w:numPr>
       </w:pPr>
       <w:r>
@@ -2043,7 +2421,7 @@
         <w:pStyle w:val="Compact"/>
         <w:numPr>
           <w:ilvl w:val="0"/>
-          <w:numId w:val="1001"/>
+          <w:numId w:val="1002"/>
         </w:numPr>
       </w:pPr>
       <w:r>
@@ -2237,8 +2615,8 @@
         </w:pict>
       </w:r>
     </w:p>
-    <w:bookmarkEnd w:id="17"/>
-    <w:bookmarkStart w:id="38" w:name="sección-3-pruebas-y-hallazgos"/>
+    <w:bookmarkEnd w:id="18"/>
+    <w:bookmarkStart w:id="39" w:name="sección-3-pruebas-y-hallazgos"/>
     <w:p>
       <w:pPr>
         <w:pStyle w:val="Heading2"/>
@@ -2315,7 +2693,7 @@
         </w:pict>
       </w:r>
     </w:p>
-    <w:bookmarkStart w:id="18" w:name="p1-formato-del-catálogo-de-habitaciones"/>
+    <w:bookmarkStart w:id="19" w:name="p1-formato-del-catálogo-de-habitaciones"/>
     <w:p>
       <w:pPr>
         <w:pStyle w:val="Heading3"/>
@@ -2409,7 +2787,7 @@
         <w:pStyle w:val="Compact"/>
         <w:numPr>
           <w:ilvl w:val="0"/>
-          <w:numId w:val="1002"/>
+          <w:numId w:val="1003"/>
         </w:numPr>
       </w:pPr>
       <w:r>
@@ -2433,7 +2811,7 @@
         <w:pStyle w:val="Compact"/>
         <w:numPr>
           <w:ilvl w:val="0"/>
-          <w:numId w:val="1002"/>
+          <w:numId w:val="1003"/>
         </w:numPr>
       </w:pPr>
       <w:r>
@@ -2673,8 +3051,8 @@
         </w:pict>
       </w:r>
     </w:p>
-    <w:bookmarkEnd w:id="18"/>
-    <w:bookmarkStart w:id="19" w:name="p2-cálculo-del-descuento-por-porcentaje"/>
+    <w:bookmarkEnd w:id="19"/>
+    <w:bookmarkStart w:id="20" w:name="p2-cálculo-del-descuento-por-porcentaje"/>
     <w:p>
       <w:pPr>
         <w:pStyle w:val="Heading3"/>
@@ -2784,7 +3162,7 @@
         <w:pStyle w:val="Compact"/>
         <w:numPr>
           <w:ilvl w:val="0"/>
-          <w:numId w:val="1003"/>
+          <w:numId w:val="1004"/>
         </w:numPr>
       </w:pPr>
       <w:r>
@@ -2808,7 +3186,7 @@
         <w:pStyle w:val="Compact"/>
         <w:numPr>
           <w:ilvl w:val="0"/>
-          <w:numId w:val="1003"/>
+          <w:numId w:val="1004"/>
         </w:numPr>
       </w:pPr>
       <w:r>
@@ -2829,7 +3207,7 @@
         <w:pStyle w:val="Compact"/>
         <w:numPr>
           <w:ilvl w:val="0"/>
-          <w:numId w:val="1003"/>
+          <w:numId w:val="1004"/>
         </w:numPr>
       </w:pPr>
       <w:r>
@@ -2850,7 +3228,7 @@
         <w:pStyle w:val="Compact"/>
         <w:numPr>
           <w:ilvl w:val="0"/>
-          <w:numId w:val="1003"/>
+          <w:numId w:val="1004"/>
         </w:numPr>
       </w:pPr>
       <w:r>
@@ -3090,8 +3468,8 @@
         </w:pict>
       </w:r>
     </w:p>
-    <w:bookmarkEnd w:id="19"/>
-    <w:bookmarkStart w:id="20" w:name="p3-cobro-de-una-reserva-con-descuento"/>
+    <w:bookmarkEnd w:id="20"/>
+    <w:bookmarkStart w:id="21" w:name="p3-cobro-de-una-reserva-con-descuento"/>
     <w:p>
       <w:pPr>
         <w:pStyle w:val="Heading3"/>
@@ -3182,7 +3560,7 @@
         <w:pStyle w:val="Compact"/>
         <w:numPr>
           <w:ilvl w:val="0"/>
-          <w:numId w:val="1004"/>
+          <w:numId w:val="1005"/>
         </w:numPr>
       </w:pPr>
       <w:r>
@@ -3206,7 +3584,7 @@
         <w:pStyle w:val="Compact"/>
         <w:numPr>
           <w:ilvl w:val="0"/>
-          <w:numId w:val="1004"/>
+          <w:numId w:val="1005"/>
         </w:numPr>
       </w:pPr>
       <w:r>
@@ -3257,7 +3635,7 @@
         <w:pStyle w:val="Compact"/>
         <w:numPr>
           <w:ilvl w:val="0"/>
-          <w:numId w:val="1004"/>
+          <w:numId w:val="1005"/>
         </w:numPr>
       </w:pPr>
       <w:r>
@@ -3544,8 +3922,8 @@
         </w:pict>
       </w:r>
     </w:p>
-    <w:bookmarkEnd w:id="20"/>
-    <w:bookmarkStart w:id="21" w:name="p4-ver-caja-sin-pedir-clave"/>
+    <w:bookmarkEnd w:id="21"/>
+    <w:bookmarkStart w:id="22" w:name="p4-ver-caja-sin-pedir-clave"/>
     <w:p>
       <w:pPr>
         <w:pStyle w:val="Heading3"/>
@@ -3657,7 +4035,7 @@
         <w:pStyle w:val="Compact"/>
         <w:numPr>
           <w:ilvl w:val="0"/>
-          <w:numId w:val="1005"/>
+          <w:numId w:val="1006"/>
         </w:numPr>
       </w:pPr>
       <w:r>
@@ -3681,7 +4059,7 @@
         <w:pStyle w:val="Compact"/>
         <w:numPr>
           <w:ilvl w:val="0"/>
-          <w:numId w:val="1005"/>
+          <w:numId w:val="1006"/>
         </w:numPr>
       </w:pPr>
       <w:r>
@@ -3928,8 +4306,8 @@
         </w:pict>
       </w:r>
     </w:p>
-    <w:bookmarkEnd w:id="21"/>
-    <w:bookmarkStart w:id="22" w:name="p5-el-arqueo-de-caja-no-cuadra"/>
+    <w:bookmarkEnd w:id="22"/>
+    <w:bookmarkStart w:id="23" w:name="p5-el-arqueo-de-caja-no-cuadra"/>
     <w:p>
       <w:pPr>
         <w:pStyle w:val="Heading3"/>
@@ -4007,7 +4385,7 @@
         <w:pStyle w:val="Compact"/>
         <w:numPr>
           <w:ilvl w:val="0"/>
-          <w:numId w:val="1006"/>
+          <w:numId w:val="1007"/>
         </w:numPr>
       </w:pPr>
       <w:r>
@@ -4044,7 +4422,7 @@
         <w:pStyle w:val="Compact"/>
         <w:numPr>
           <w:ilvl w:val="0"/>
-          <w:numId w:val="1006"/>
+          <w:numId w:val="1007"/>
         </w:numPr>
       </w:pPr>
       <w:r>
@@ -4071,7 +4449,7 @@
         <w:pStyle w:val="Compact"/>
         <w:numPr>
           <w:ilvl w:val="0"/>
-          <w:numId w:val="1006"/>
+          <w:numId w:val="1007"/>
         </w:numPr>
       </w:pPr>
       <w:r>
@@ -4358,8 +4736,8 @@
         </w:pict>
       </w:r>
     </w:p>
-    <w:bookmarkEnd w:id="22"/>
-    <w:bookmarkStart w:id="23" w:name="X920233b409b857648fecf33eeb0a41cc1ad6a5d"/>
+    <w:bookmarkEnd w:id="23"/>
+    <w:bookmarkStart w:id="24" w:name="X920233b409b857648fecf33eeb0a41cc1ad6a5d"/>
     <w:p>
       <w:pPr>
         <w:pStyle w:val="Heading3"/>
@@ -4453,7 +4831,7 @@
         <w:pStyle w:val="Compact"/>
         <w:numPr>
           <w:ilvl w:val="0"/>
-          <w:numId w:val="1007"/>
+          <w:numId w:val="1008"/>
         </w:numPr>
       </w:pPr>
       <w:r>
@@ -4529,7 +4907,7 @@
         <w:pStyle w:val="Compact"/>
         <w:numPr>
           <w:ilvl w:val="0"/>
-          <w:numId w:val="1007"/>
+          <w:numId w:val="1008"/>
         </w:numPr>
       </w:pPr>
       <w:r>
@@ -4541,7 +4919,7 @@
         <w:pStyle w:val="Compact"/>
         <w:numPr>
           <w:ilvl w:val="0"/>
-          <w:numId w:val="1007"/>
+          <w:numId w:val="1008"/>
         </w:numPr>
       </w:pPr>
       <w:r>
@@ -4852,8 +5230,8 @@
         </w:pict>
       </w:r>
     </w:p>
-    <w:bookmarkEnd w:id="23"/>
-    <w:bookmarkStart w:id="24" w:name="p7-cancelar-reserva-sin-confirmación"/>
+    <w:bookmarkEnd w:id="24"/>
+    <w:bookmarkStart w:id="25" w:name="p7-cancelar-reserva-sin-confirmación"/>
     <w:p>
       <w:pPr>
         <w:pStyle w:val="Heading3"/>
@@ -4959,7 +5337,7 @@
         <w:pStyle w:val="Compact"/>
         <w:numPr>
           <w:ilvl w:val="0"/>
-          <w:numId w:val="1008"/>
+          <w:numId w:val="1009"/>
         </w:numPr>
       </w:pPr>
       <w:r>
@@ -4995,7 +5373,7 @@
         <w:pStyle w:val="Compact"/>
         <w:numPr>
           <w:ilvl w:val="0"/>
-          <w:numId w:val="1008"/>
+          <w:numId w:val="1009"/>
         </w:numPr>
       </w:pPr>
       <w:r>
@@ -5248,8 +5626,8 @@
         </w:pict>
       </w:r>
     </w:p>
-    <w:bookmarkEnd w:id="24"/>
-    <w:bookmarkStart w:id="25" w:name="X84a72f4d381739e730a8fbe6baf6bbf24728236"/>
+    <w:bookmarkEnd w:id="25"/>
+    <w:bookmarkStart w:id="26" w:name="X84a72f4d381739e730a8fbe6baf6bbf24728236"/>
     <w:p>
       <w:pPr>
         <w:pStyle w:val="Heading3"/>
@@ -5360,7 +5738,7 @@
         <w:pStyle w:val="Compact"/>
         <w:numPr>
           <w:ilvl w:val="0"/>
-          <w:numId w:val="1009"/>
+          <w:numId w:val="1010"/>
         </w:numPr>
       </w:pPr>
       <w:r>
@@ -5384,7 +5762,7 @@
         <w:pStyle w:val="Compact"/>
         <w:numPr>
           <w:ilvl w:val="0"/>
-          <w:numId w:val="1009"/>
+          <w:numId w:val="1010"/>
         </w:numPr>
       </w:pPr>
       <w:r>
@@ -5674,8 +6052,8 @@
         </w:pict>
       </w:r>
     </w:p>
-    <w:bookmarkEnd w:id="25"/>
-    <w:bookmarkStart w:id="26" w:name="p9-cancelar-reserva-sin-clave"/>
+    <w:bookmarkEnd w:id="26"/>
+    <w:bookmarkStart w:id="27" w:name="p9-cancelar-reserva-sin-clave"/>
     <w:p>
       <w:pPr>
         <w:pStyle w:val="Heading3"/>
@@ -5765,7 +6143,7 @@
         <w:pStyle w:val="Compact"/>
         <w:numPr>
           <w:ilvl w:val="0"/>
-          <w:numId w:val="1010"/>
+          <w:numId w:val="1011"/>
         </w:numPr>
       </w:pPr>
       <w:r>
@@ -5996,8 +6374,8 @@
         </w:pict>
       </w:r>
     </w:p>
-    <w:bookmarkEnd w:id="26"/>
-    <w:bookmarkStart w:id="27" w:name="Xfddd6be272cbc5c383fc12f2e1832d55d876792"/>
+    <w:bookmarkEnd w:id="27"/>
+    <w:bookmarkStart w:id="28" w:name="Xfddd6be272cbc5c383fc12f2e1832d55d876792"/>
     <w:p>
       <w:pPr>
         <w:pStyle w:val="Heading3"/>
@@ -6103,7 +6481,7 @@
         <w:pStyle w:val="Compact"/>
         <w:numPr>
           <w:ilvl w:val="0"/>
-          <w:numId w:val="1011"/>
+          <w:numId w:val="1012"/>
         </w:numPr>
       </w:pPr>
       <w:r>
@@ -6127,7 +6505,7 @@
         <w:pStyle w:val="Compact"/>
         <w:numPr>
           <w:ilvl w:val="0"/>
-          <w:numId w:val="1011"/>
+          <w:numId w:val="1012"/>
         </w:numPr>
       </w:pPr>
       <w:r>
@@ -6148,7 +6526,7 @@
         <w:pStyle w:val="Compact"/>
         <w:numPr>
           <w:ilvl w:val="0"/>
-          <w:numId w:val="1011"/>
+          <w:numId w:val="1012"/>
         </w:numPr>
       </w:pPr>
       <w:r>
@@ -6379,8 +6757,8 @@
         </w:pict>
       </w:r>
     </w:p>
-    <w:bookmarkEnd w:id="27"/>
-    <w:bookmarkStart w:id="28" w:name="X9fd7f2cffc35eb16f6166344b85834e5d120175"/>
+    <w:bookmarkEnd w:id="28"/>
+    <w:bookmarkStart w:id="29" w:name="X9fd7f2cffc35eb16f6166344b85834e5d120175"/>
     <w:p>
       <w:pPr>
         <w:pStyle w:val="Heading3"/>
@@ -6489,7 +6867,7 @@
         <w:pStyle w:val="Compact"/>
         <w:numPr>
           <w:ilvl w:val="0"/>
-          <w:numId w:val="1012"/>
+          <w:numId w:val="1013"/>
         </w:numPr>
       </w:pPr>
       <w:r>
@@ -6513,7 +6891,7 @@
         <w:pStyle w:val="Compact"/>
         <w:numPr>
           <w:ilvl w:val="0"/>
-          <w:numId w:val="1012"/>
+          <w:numId w:val="1013"/>
         </w:numPr>
       </w:pPr>
       <w:r>
@@ -6801,8 +7179,8 @@
         </w:pict>
       </w:r>
     </w:p>
-    <w:bookmarkEnd w:id="28"/>
-    <w:bookmarkStart w:id="29" w:name="p12-el-csv-exportado-abre-mal-en-excel"/>
+    <w:bookmarkEnd w:id="29"/>
+    <w:bookmarkStart w:id="30" w:name="p12-el-csv-exportado-abre-mal-en-excel"/>
     <w:p>
       <w:pPr>
         <w:pStyle w:val="Heading3"/>
@@ -6923,7 +7301,7 @@
         <w:pStyle w:val="Compact"/>
         <w:numPr>
           <w:ilvl w:val="0"/>
-          <w:numId w:val="1013"/>
+          <w:numId w:val="1014"/>
         </w:numPr>
       </w:pPr>
       <w:r>
@@ -6935,7 +7313,7 @@
         <w:pStyle w:val="Compact"/>
         <w:numPr>
           <w:ilvl w:val="0"/>
-          <w:numId w:val="1013"/>
+          <w:numId w:val="1014"/>
         </w:numPr>
       </w:pPr>
       <w:r>
@@ -6976,7 +7354,7 @@
         <w:pStyle w:val="Compact"/>
         <w:numPr>
           <w:ilvl w:val="0"/>
-          <w:numId w:val="1013"/>
+          <w:numId w:val="1014"/>
         </w:numPr>
       </w:pPr>
       <w:r>
@@ -7311,8 +7689,8 @@
         </w:pict>
       </w:r>
     </w:p>
-    <w:bookmarkEnd w:id="29"/>
-    <w:bookmarkStart w:id="30" w:name="X047dc1c628065169ccb5d04f093bbce968ebb1d"/>
+    <w:bookmarkEnd w:id="30"/>
+    <w:bookmarkStart w:id="31" w:name="X047dc1c628065169ccb5d04f093bbce968ebb1d"/>
     <w:p>
       <w:pPr>
         <w:pStyle w:val="Heading3"/>
@@ -7402,7 +7780,7 @@
         <w:pStyle w:val="Compact"/>
         <w:numPr>
           <w:ilvl w:val="0"/>
-          <w:numId w:val="1014"/>
+          <w:numId w:val="1015"/>
         </w:numPr>
       </w:pPr>
       <w:r>
@@ -7456,7 +7834,7 @@
         <w:pStyle w:val="Compact"/>
         <w:numPr>
           <w:ilvl w:val="0"/>
-          <w:numId w:val="1014"/>
+          <w:numId w:val="1015"/>
         </w:numPr>
       </w:pPr>
       <w:r>
@@ -7715,8 +8093,8 @@
         </w:pict>
       </w:r>
     </w:p>
-    <w:bookmarkEnd w:id="30"/>
-    <w:bookmarkStart w:id="31" w:name="X1420aa70f72c2e5afbf5074a0a4a6c56bf3811c"/>
+    <w:bookmarkEnd w:id="31"/>
+    <w:bookmarkStart w:id="32" w:name="X1420aa70f72c2e5afbf5074a0a4a6c56bf3811c"/>
     <w:p>
       <w:pPr>
         <w:pStyle w:val="Heading3"/>
@@ -7826,7 +8204,7 @@
         <w:pStyle w:val="Compact"/>
         <w:numPr>
           <w:ilvl w:val="0"/>
-          <w:numId w:val="1015"/>
+          <w:numId w:val="1016"/>
         </w:numPr>
       </w:pPr>
       <w:r>
@@ -7850,7 +8228,7 @@
         <w:pStyle w:val="Compact"/>
         <w:numPr>
           <w:ilvl w:val="0"/>
-          <w:numId w:val="1015"/>
+          <w:numId w:val="1016"/>
         </w:numPr>
       </w:pPr>
       <w:r>
@@ -7862,7 +8240,7 @@
         <w:pStyle w:val="Compact"/>
         <w:numPr>
           <w:ilvl w:val="0"/>
-          <w:numId w:val="1015"/>
+          <w:numId w:val="1016"/>
         </w:numPr>
       </w:pPr>
       <w:r>
@@ -7883,7 +8261,7 @@
         <w:pStyle w:val="Compact"/>
         <w:numPr>
           <w:ilvl w:val="0"/>
-          <w:numId w:val="1015"/>
+          <w:numId w:val="1016"/>
         </w:numPr>
       </w:pPr>
       <w:r>
@@ -8311,8 +8689,8 @@
         </w:pict>
       </w:r>
     </w:p>
-    <w:bookmarkEnd w:id="31"/>
-    <w:bookmarkStart w:id="32" w:name="X138b45a7e69919aa943063d5a31780f190185ef"/>
+    <w:bookmarkEnd w:id="32"/>
+    <w:bookmarkStart w:id="33" w:name="X138b45a7e69919aa943063d5a31780f190185ef"/>
     <w:p>
       <w:pPr>
         <w:pStyle w:val="Heading3"/>
@@ -8399,7 +8777,7 @@
         <w:pStyle w:val="Compact"/>
         <w:numPr>
           <w:ilvl w:val="0"/>
-          <w:numId w:val="1016"/>
+          <w:numId w:val="1017"/>
         </w:numPr>
       </w:pPr>
       <w:r>
@@ -8427,7 +8805,7 @@
         <w:pStyle w:val="Compact"/>
         <w:numPr>
           <w:ilvl w:val="0"/>
-          <w:numId w:val="1016"/>
+          <w:numId w:val="1017"/>
         </w:numPr>
       </w:pPr>
       <w:r>
@@ -8478,7 +8856,7 @@
         <w:pStyle w:val="Compact"/>
         <w:numPr>
           <w:ilvl w:val="0"/>
-          <w:numId w:val="1016"/>
+          <w:numId w:val="1017"/>
         </w:numPr>
       </w:pPr>
       <w:r>
@@ -8848,8 +9226,8 @@
         </w:pict>
       </w:r>
     </w:p>
-    <w:bookmarkEnd w:id="32"/>
-    <w:bookmarkStart w:id="33" w:name="p16-acepta-descuentos-precios-negativos"/>
+    <w:bookmarkEnd w:id="33"/>
+    <w:bookmarkStart w:id="34" w:name="p16-acepta-descuentos-precios-negativos"/>
     <w:p>
       <w:pPr>
         <w:pStyle w:val="Heading3"/>
@@ -8943,7 +9321,7 @@
         <w:pStyle w:val="Compact"/>
         <w:numPr>
           <w:ilvl w:val="0"/>
-          <w:numId w:val="1017"/>
+          <w:numId w:val="1018"/>
         </w:numPr>
       </w:pPr>
       <w:r>
@@ -8994,7 +9372,7 @@
         <w:pStyle w:val="Compact"/>
         <w:numPr>
           <w:ilvl w:val="0"/>
-          <w:numId w:val="1017"/>
+          <w:numId w:val="1018"/>
         </w:numPr>
       </w:pPr>
       <w:r>
@@ -9225,8 +9603,8 @@
         </w:pict>
       </w:r>
     </w:p>
-    <w:bookmarkEnd w:id="33"/>
-    <w:bookmarkStart w:id="34" w:name="X1ad6927862fbb3626c43877badefedf45aa2878"/>
+    <w:bookmarkEnd w:id="34"/>
+    <w:bookmarkStart w:id="35" w:name="X1ad6927862fbb3626c43877badefedf45aa2878"/>
     <w:p>
       <w:pPr>
         <w:pStyle w:val="Heading3"/>
@@ -9317,7 +9695,7 @@
         <w:pStyle w:val="Compact"/>
         <w:numPr>
           <w:ilvl w:val="0"/>
-          <w:numId w:val="1018"/>
+          <w:numId w:val="1019"/>
         </w:numPr>
       </w:pPr>
       <w:r>
@@ -9345,7 +9723,7 @@
         <w:pStyle w:val="Compact"/>
         <w:numPr>
           <w:ilvl w:val="0"/>
-          <w:numId w:val="1018"/>
+          <w:numId w:val="1019"/>
         </w:numPr>
       </w:pPr>
       <w:r>
@@ -9680,8 +10058,8 @@
         </w:pict>
       </w:r>
     </w:p>
-    <w:bookmarkEnd w:id="34"/>
-    <w:bookmarkStart w:id="35" w:name="X6eb67bd05ccaafba71bcad2fd8dc3458a6823d6"/>
+    <w:bookmarkEnd w:id="35"/>
+    <w:bookmarkStart w:id="36" w:name="X6eb67bd05ccaafba71bcad2fd8dc3458a6823d6"/>
     <w:p>
       <w:pPr>
         <w:pStyle w:val="Heading3"/>
@@ -9775,7 +10153,7 @@
         <w:pStyle w:val="Compact"/>
         <w:numPr>
           <w:ilvl w:val="0"/>
-          <w:numId w:val="1019"/>
+          <w:numId w:val="1020"/>
         </w:numPr>
       </w:pPr>
       <w:r>
@@ -10207,8 +10585,8 @@
         </w:pict>
       </w:r>
     </w:p>
-    <w:bookmarkEnd w:id="35"/>
-    <w:bookmarkStart w:id="36" w:name="X0582fe7733af528600f4d43e8e0406cd7c26787"/>
+    <w:bookmarkEnd w:id="36"/>
+    <w:bookmarkStart w:id="37" w:name="X0582fe7733af528600f4d43e8e0406cd7c26787"/>
     <w:p>
       <w:pPr>
         <w:pStyle w:val="Heading3"/>
@@ -10302,7 +10680,7 @@
         <w:pStyle w:val="Compact"/>
         <w:numPr>
           <w:ilvl w:val="0"/>
-          <w:numId w:val="1020"/>
+          <w:numId w:val="1021"/>
         </w:numPr>
       </w:pPr>
       <w:r>
@@ -10330,7 +10708,7 @@
         <w:pStyle w:val="Compact"/>
         <w:numPr>
           <w:ilvl w:val="0"/>
-          <w:numId w:val="1020"/>
+          <w:numId w:val="1021"/>
         </w:numPr>
       </w:pPr>
       <w:r>
@@ -10677,8 +11055,8 @@
         </w:pict>
       </w:r>
     </w:p>
-    <w:bookmarkEnd w:id="36"/>
-    <w:bookmarkStart w:id="37" w:name="p20-mensajes-de-error-en-clave"/>
+    <w:bookmarkEnd w:id="37"/>
+    <w:bookmarkStart w:id="38" w:name="p20-mensajes-de-error-en-clave"/>
     <w:p>
       <w:pPr>
         <w:pStyle w:val="Heading3"/>
@@ -10787,7 +11165,7 @@
         <w:pStyle w:val="Compact"/>
         <w:numPr>
           <w:ilvl w:val="0"/>
-          <w:numId w:val="1021"/>
+          <w:numId w:val="1022"/>
         </w:numPr>
       </w:pPr>
       <w:r>
@@ -10844,7 +11222,7 @@
         <w:pStyle w:val="Compact"/>
         <w:numPr>
           <w:ilvl w:val="0"/>
-          <w:numId w:val="1021"/>
+          <w:numId w:val="1022"/>
         </w:numPr>
       </w:pPr>
       <w:r>
@@ -11093,9 +11471,9 @@
         </w:pict>
       </w:r>
     </w:p>
-    <w:bookmarkEnd w:id="37"/>
     <w:bookmarkEnd w:id="38"/>
-    <w:bookmarkStart w:id="47" w:name="X86988ce84f48faf8fe4ae5e20a3aea8bae3d0b2"/>
+    <w:bookmarkEnd w:id="39"/>
+    <w:bookmarkStart w:id="48" w:name="X86988ce84f48faf8fe4ae5e20a3aea8bae3d0b2"/>
     <w:p>
       <w:pPr>
         <w:pStyle w:val="Heading2"/>
@@ -11162,22 +11540,7 @@
         <w:t xml:space="preserve">exactamente qué archivo abrir y qué palabra buscar</w:t>
       </w:r>
       <w:r>
-        <w:t xml:space="preserve"> </w:t>
-      </w:r>
-      <w:r>
-        <w:t xml:space="preserve">(</w:t>
-      </w:r>
-      <w:r>
-        <w:rPr>
-          <w:rStyle w:val="VerbatimChar"/>
-        </w:rPr>
-        <w:t xml:space="preserve">Ctrl+F</w:t>
-      </w:r>
-      <w:r>
-        <w:t xml:space="preserve"> </w:t>
-      </w:r>
-      <w:r>
-        <w:t xml:space="preserve">en el editor, o el comando de terminal que se da). No necesitas releer el archivo completo: busca solo esa palabra y mira las 3-4 líneas alrededor.</w:t>
+        <w:t xml:space="preserve">. Usa la guía de búsqueda de la Sección 1 (Ctrl+F en el editor, o el número de línea que ya imprime el comando de terminal). No necesitas releer el archivo completo: busca solo esa palabra y mira las 3-4 líneas alrededor.</w:t>
       </w:r>
     </w:p>
     <w:p>
@@ -11187,7 +11550,7 @@
         </w:pict>
       </w:r>
     </w:p>
-    <w:bookmarkStart w:id="39" w:name="Xe435a1254e22d221bebf508a775a6056403aa91"/>
+    <w:bookmarkStart w:id="40" w:name="Xe435a1254e22d221bebf508a775a6056403aa91"/>
     <w:p>
       <w:pPr>
         <w:pStyle w:val="Heading3"/>
@@ -11430,8 +11793,8 @@
         </w:pict>
       </w:r>
     </w:p>
-    <w:bookmarkEnd w:id="39"/>
-    <w:bookmarkStart w:id="40" w:name="X26522fe81648107c3d2c9ea6a8d58e06a312548"/>
+    <w:bookmarkEnd w:id="40"/>
+    <w:bookmarkStart w:id="41" w:name="X26522fe81648107c3d2c9ea6a8d58e06a312548"/>
     <w:p>
       <w:pPr>
         <w:pStyle w:val="Heading3"/>
@@ -11743,8 +12106,8 @@
         </w:pict>
       </w:r>
     </w:p>
-    <w:bookmarkEnd w:id="40"/>
-    <w:bookmarkStart w:id="41" w:name="X00ca0120030d8c0148806b1579d88ee64e85ef1"/>
+    <w:bookmarkEnd w:id="41"/>
+    <w:bookmarkStart w:id="42" w:name="X00ca0120030d8c0148806b1579d88ee64e85ef1"/>
     <w:p>
       <w:pPr>
         <w:pStyle w:val="Heading3"/>
@@ -12021,8 +12384,8 @@
         </w:pict>
       </w:r>
     </w:p>
-    <w:bookmarkEnd w:id="41"/>
-    <w:bookmarkStart w:id="42" w:name="Xce10cf669c05a4de443d571e09f45ca93d6a41d"/>
+    <w:bookmarkEnd w:id="42"/>
+    <w:bookmarkStart w:id="43" w:name="Xce10cf669c05a4de443d571e09f45ca93d6a41d"/>
     <w:p>
       <w:pPr>
         <w:pStyle w:val="Heading3"/>
@@ -12280,8 +12643,8 @@
         </w:pict>
       </w:r>
     </w:p>
-    <w:bookmarkEnd w:id="42"/>
-    <w:bookmarkStart w:id="43" w:name="X974faf49995bc599a75e56884eb7f87e640a1c4"/>
+    <w:bookmarkEnd w:id="43"/>
+    <w:bookmarkStart w:id="44" w:name="X974faf49995bc599a75e56884eb7f87e640a1c4"/>
     <w:p>
       <w:pPr>
         <w:pStyle w:val="Heading3"/>
@@ -12524,8 +12887,8 @@
         </w:pict>
       </w:r>
     </w:p>
-    <w:bookmarkEnd w:id="43"/>
-    <w:bookmarkStart w:id="44" w:name="Xb40836b2be8d83ba13766720a421150ea1a8d79"/>
+    <w:bookmarkEnd w:id="44"/>
+    <w:bookmarkStart w:id="45" w:name="Xb40836b2be8d83ba13766720a421150ea1a8d79"/>
     <w:p>
       <w:pPr>
         <w:pStyle w:val="Heading3"/>
@@ -12768,8 +13131,8 @@
         </w:pict>
       </w:r>
     </w:p>
-    <w:bookmarkEnd w:id="44"/>
-    <w:bookmarkStart w:id="45" w:name="X7e28105e4b8ac3f0f11d3c68d3c1fc18ef68be5"/>
+    <w:bookmarkEnd w:id="45"/>
+    <w:bookmarkStart w:id="46" w:name="X7e28105e4b8ac3f0f11d3c68d3c1fc18ef68be5"/>
     <w:p>
       <w:pPr>
         <w:pStyle w:val="Heading3"/>
@@ -13045,8 +13408,8 @@
         </w:pict>
       </w:r>
     </w:p>
-    <w:bookmarkEnd w:id="45"/>
-    <w:bookmarkStart w:id="46" w:name="X42469869f84514ae1b5fe2007c3b1f8ffe82e0d"/>
+    <w:bookmarkEnd w:id="46"/>
+    <w:bookmarkStart w:id="47" w:name="X42469869f84514ae1b5fe2007c3b1f8ffe82e0d"/>
     <w:p>
       <w:pPr>
         <w:pStyle w:val="Heading3"/>
@@ -13233,9 +13596,9 @@
         </w:pict>
       </w:r>
     </w:p>
-    <w:bookmarkEnd w:id="46"/>
     <w:bookmarkEnd w:id="47"/>
-    <w:bookmarkStart w:id="48" w:name="sección-5-resumen-por-característica"/>
+    <w:bookmarkEnd w:id="48"/>
+    <w:bookmarkStart w:id="49" w:name="sección-5-resumen-por-característica"/>
     <w:p>
       <w:pPr>
         <w:pStyle w:val="Heading2"/>
@@ -13780,8 +14143,8 @@
         </w:pict>
       </w:r>
     </w:p>
-    <w:bookmarkEnd w:id="48"/>
-    <w:bookmarkStart w:id="49" w:name="sección-6-línea-base-consolidada"/>
+    <w:bookmarkEnd w:id="49"/>
+    <w:bookmarkStart w:id="50" w:name="sección-6-línea-base-consolidada"/>
     <w:p>
       <w:pPr>
         <w:pStyle w:val="Heading2"/>
@@ -13890,8 +14253,8 @@
         </w:pict>
       </w:r>
     </w:p>
-    <w:bookmarkEnd w:id="49"/>
-    <w:bookmarkStart w:id="50" w:name="Xb53e43047b2c965d6df87cd1ef7b9f746f73fdf"/>
+    <w:bookmarkEnd w:id="50"/>
+    <w:bookmarkStart w:id="51" w:name="Xb53e43047b2c965d6df87cd1ef7b9f746f73fdf"/>
     <w:p>
       <w:pPr>
         <w:pStyle w:val="Heading2"/>
@@ -13953,8 +14316,8 @@
         </w:pict>
       </w:r>
     </w:p>
-    <w:bookmarkEnd w:id="50"/>
-    <w:bookmarkStart w:id="51" w:name="sección-8-dictamen-de-línea-base"/>
+    <w:bookmarkEnd w:id="51"/>
+    <w:bookmarkStart w:id="52" w:name="sección-8-dictamen-de-línea-base"/>
     <w:p>
       <w:pPr>
         <w:pStyle w:val="Heading2"/>
@@ -14060,8 +14423,8 @@
         </w:pict>
       </w:r>
     </w:p>
-    <w:bookmarkEnd w:id="51"/>
-    <w:bookmarkStart w:id="52" w:name="X119c6f9b5d452e7acb7b8786c8c8a7181515868"/>
+    <w:bookmarkEnd w:id="52"/>
+    <w:bookmarkStart w:id="53" w:name="X119c6f9b5d452e7acb7b8786c8c8a7181515868"/>
     <w:p>
       <w:pPr>
         <w:pStyle w:val="Heading2"/>
@@ -14210,8 +14573,8 @@
         </w:pict>
       </w:r>
     </w:p>
-    <w:bookmarkEnd w:id="52"/>
-    <w:bookmarkStart w:id="53" w:name="sección-10-firmas"/>
+    <w:bookmarkEnd w:id="53"/>
+    <w:bookmarkStart w:id="54" w:name="sección-10-firmas"/>
     <w:p>
       <w:pPr>
         <w:pStyle w:val="Heading2"/>
@@ -14241,8 +14604,8 @@
         <w:t xml:space="preserve">Responsable del reporte (célula) Docente</w:t>
       </w:r>
     </w:p>
-    <w:bookmarkEnd w:id="53"/>
     <w:bookmarkEnd w:id="54"/>
+    <w:bookmarkEnd w:id="55"/>
     <w:sectPr>
       <w:footnotePr>
         <w:numRestart w:val="eachSect"/>
@@ -15042,6 +15405,36 @@
     </w:lvlOverride>
   </w:num>
   <w:num w:numId="1021">
+    <w:abstractNumId w:val="99411"/>
+    <w:lvlOverride w:ilvl="0">
+      <w:startOverride w:val="1"/>
+    </w:lvlOverride>
+    <w:lvlOverride w:ilvl="1">
+      <w:startOverride w:val="1"/>
+    </w:lvlOverride>
+    <w:lvlOverride w:ilvl="2">
+      <w:startOverride w:val="1"/>
+    </w:lvlOverride>
+    <w:lvlOverride w:ilvl="3">
+      <w:startOverride w:val="1"/>
+    </w:lvlOverride>
+    <w:lvlOverride w:ilvl="4">
+      <w:startOverride w:val="1"/>
+    </w:lvlOverride>
+    <w:lvlOverride w:ilvl="5">
+      <w:startOverride w:val="1"/>
+    </w:lvlOverride>
+    <w:lvlOverride w:ilvl="6">
+      <w:startOverride w:val="1"/>
+    </w:lvlOverride>
+    <w:lvlOverride w:ilvl="7">
+      <w:startOverride w:val="1"/>
+    </w:lvlOverride>
+    <w:lvlOverride w:ilvl="8">
+      <w:startOverride w:val="1"/>
+    </w:lvlOverride>
+  </w:num>
+  <w:num w:numId="1022">
     <w:abstractNumId w:val="99411"/>
     <w:lvlOverride w:ilvl="0">
       <w:startOverride w:val="1"/>

</xml_diff>

<commit_message>
Agrega busqueda global (Ctrl+Shift+F) e ir-a-linea (Ctrl+G) a la guia
Complementa la guia de busqueda de la Seccion 1 con una tercera tecnica
para cuando la palabra puede estar en varios archivos a la vez (util en
PB7 y CR4), y un atajo para saltar directo a una linea ya conocida.

Co-Authored-By: Claude Sonnet 5 <noreply@anthropic.com>
Claude-Session: https://claude.ai/code/session_01TTepGRhLskzGbvCLqhHRgM
</commit_message>
<xml_diff>
--- a/docs/FICHA_DIAGNOSTICO_ISO25010_MINIHOTEL.docx
+++ b/docs/FICHA_DIAGNOSTICO_ISO25010_MINIHOTEL.docx
@@ -1443,6 +1443,182 @@
           <w:b/>
           <w:bCs/>
         </w:rPr>
+        <w:t xml:space="preserve">Opción C — buscar en TODOS los archivos a la vez (VS Code, para PB7 y CR4):</w:t>
+      </w:r>
+    </w:p>
+    <w:p>
+      <w:pPr>
+        <w:pStyle w:val="BodyText"/>
+      </w:pPr>
+      <w:r>
+        <w:t xml:space="preserve">Cuando la palabra puede estar repartida en varios archivos (por ejemplo</w:t>
+      </w:r>
+      <w:r>
+        <w:t xml:space="preserve"> </w:t>
+      </w:r>
+      <w:r>
+        <w:rPr>
+          <w:rStyle w:val="VerbatimChar"/>
+        </w:rPr>
+        <w:t xml:space="preserve">S/</w:t>
+      </w:r>
+      <w:r>
+        <w:t xml:space="preserve"> </w:t>
+      </w:r>
+      <w:r>
+        <w:t xml:space="preserve">en PB7, o</w:t>
+      </w:r>
+      <w:r>
+        <w:t xml:space="preserve"> </w:t>
+      </w:r>
+      <w:r>
+        <w:rPr>
+          <w:rStyle w:val="VerbatimChar"/>
+        </w:rPr>
+        <w:t xml:space="preserve">Defecto sembrado</w:t>
+      </w:r>
+      <w:r>
+        <w:t xml:space="preserve"> </w:t>
+      </w:r>
+      <w:r>
+        <w:t xml:space="preserve">en CR4), no busques archivo por archivo:</w:t>
+      </w:r>
+    </w:p>
+    <w:p>
+      <w:pPr>
+        <w:pStyle w:val="Compact"/>
+        <w:numPr>
+          <w:ilvl w:val="0"/>
+          <w:numId w:val="1002"/>
+        </w:numPr>
+      </w:pPr>
+      <w:r>
+        <w:t xml:space="preserve">En VS Code, presiona</w:t>
+      </w:r>
+      <w:r>
+        <w:t xml:space="preserve"> </w:t>
+      </w:r>
+      <w:r>
+        <w:rPr>
+          <w:b/>
+          <w:bCs/>
+        </w:rPr>
+        <w:t xml:space="preserve">Ctrl+Shift+F</w:t>
+      </w:r>
+      <w:r>
+        <w:t xml:space="preserve"> </w:t>
+      </w:r>
+      <w:r>
+        <w:t xml:space="preserve">(búsqueda global) en vez de Ctrl+F.</w:t>
+      </w:r>
+    </w:p>
+    <w:p>
+      <w:pPr>
+        <w:pStyle w:val="Compact"/>
+        <w:numPr>
+          <w:ilvl w:val="0"/>
+          <w:numId w:val="1002"/>
+        </w:numPr>
+      </w:pPr>
+      <w:r>
+        <w:t xml:space="preserve">Escribe la palabra. A la izquierda aparece la lista de</w:t>
+      </w:r>
+      <w:r>
+        <w:t xml:space="preserve"> </w:t>
+      </w:r>
+      <w:r>
+        <w:rPr>
+          <w:b/>
+          <w:bCs/>
+        </w:rPr>
+        <w:t xml:space="preserve">todos</w:t>
+      </w:r>
+      <w:r>
+        <w:t xml:space="preserve"> </w:t>
+      </w:r>
+      <w:r>
+        <w:t xml:space="preserve">los archivos donde aparece, con el número de línea al lado de cada resultado.</w:t>
+      </w:r>
+    </w:p>
+    <w:p>
+      <w:pPr>
+        <w:pStyle w:val="Compact"/>
+        <w:numPr>
+          <w:ilvl w:val="0"/>
+          <w:numId w:val="1002"/>
+        </w:numPr>
+      </w:pPr>
+      <w:r>
+        <w:t xml:space="preserve">Clic en cualquier resultado y te lleva directo a esa línea, en ese archivo.</w:t>
+      </w:r>
+    </w:p>
+    <w:p>
+      <w:pPr>
+        <w:pStyle w:val="FirstParagraph"/>
+      </w:pPr>
+      <w:r>
+        <w:rPr>
+          <w:b/>
+          <w:bCs/>
+        </w:rPr>
+        <w:t xml:space="preserve">Truco extra — ir directo a una línea que ya conoces:</w:t>
+      </w:r>
+      <w:r>
+        <w:t xml:space="preserve"> </w:t>
+      </w:r>
+      <w:r>
+        <w:t xml:space="preserve">si el comando de terminal ya te dio el número (ej.</w:t>
+      </w:r>
+      <w:r>
+        <w:t xml:space="preserve"> </w:t>
+      </w:r>
+      <w:r>
+        <w:rPr>
+          <w:rStyle w:val="VerbatimChar"/>
+        </w:rPr>
+        <w:t xml:space="preserve">131:</w:t>
+      </w:r>
+      <w:r>
+        <w:t xml:space="preserve">), en VS Code presiona</w:t>
+      </w:r>
+      <w:r>
+        <w:t xml:space="preserve"> </w:t>
+      </w:r>
+      <w:r>
+        <w:rPr>
+          <w:b/>
+          <w:bCs/>
+        </w:rPr>
+        <w:t xml:space="preserve">Ctrl+G</w:t>
+      </w:r>
+      <w:r>
+        <w:t xml:space="preserve">, escribe</w:t>
+      </w:r>
+      <w:r>
+        <w:t xml:space="preserve"> </w:t>
+      </w:r>
+      <w:r>
+        <w:rPr>
+          <w:rStyle w:val="VerbatimChar"/>
+        </w:rPr>
+        <w:t xml:space="preserve">131</w:t>
+      </w:r>
+      <w:r>
+        <w:t xml:space="preserve"> </w:t>
+      </w:r>
+      <w:r>
+        <w:t xml:space="preserve">y Enter: te lleva directo ahí sin tener que buscar.</w:t>
+      </w:r>
+    </w:p>
+    <w:p>
+      <w:pPr>
+        <w:pStyle w:val="BodyText"/>
+      </w:pPr>
+      <w:r>
+        <w:rPr>
+          <w:b/>
+          <w:bCs/>
+        </w:rPr>
         <w:t xml:space="preserve">Para la</w:t>
       </w:r>
       <w:r>
@@ -1497,7 +1673,7 @@
         <w:t xml:space="preserve">hotel.py:131</w:t>
       </w:r>
       <w:r>
-        <w:t xml:space="preserve">), usando cualquiera de las dos opciones de arriba.</w:t>
+        <w:t xml:space="preserve">), usando cualquiera de las opciones de arriba.</w:t>
       </w:r>
     </w:p>
     <w:p>
@@ -2367,7 +2543,7 @@
         <w:pStyle w:val="Compact"/>
         <w:numPr>
           <w:ilvl w:val="0"/>
-          <w:numId w:val="1002"/>
+          <w:numId w:val="1003"/>
         </w:numPr>
       </w:pPr>
       <w:r>
@@ -2379,7 +2555,7 @@
         <w:pStyle w:val="Compact"/>
         <w:numPr>
           <w:ilvl w:val="0"/>
-          <w:numId w:val="1002"/>
+          <w:numId w:val="1003"/>
         </w:numPr>
       </w:pPr>
       <w:r>
@@ -2421,7 +2597,7 @@
         <w:pStyle w:val="Compact"/>
         <w:numPr>
           <w:ilvl w:val="0"/>
-          <w:numId w:val="1002"/>
+          <w:numId w:val="1003"/>
         </w:numPr>
       </w:pPr>
       <w:r>
@@ -2787,7 +2963,7 @@
         <w:pStyle w:val="Compact"/>
         <w:numPr>
           <w:ilvl w:val="0"/>
-          <w:numId w:val="1003"/>
+          <w:numId w:val="1004"/>
         </w:numPr>
       </w:pPr>
       <w:r>
@@ -2811,7 +2987,7 @@
         <w:pStyle w:val="Compact"/>
         <w:numPr>
           <w:ilvl w:val="0"/>
-          <w:numId w:val="1003"/>
+          <w:numId w:val="1004"/>
         </w:numPr>
       </w:pPr>
       <w:r>
@@ -3162,7 +3338,7 @@
         <w:pStyle w:val="Compact"/>
         <w:numPr>
           <w:ilvl w:val="0"/>
-          <w:numId w:val="1004"/>
+          <w:numId w:val="1005"/>
         </w:numPr>
       </w:pPr>
       <w:r>
@@ -3186,7 +3362,7 @@
         <w:pStyle w:val="Compact"/>
         <w:numPr>
           <w:ilvl w:val="0"/>
-          <w:numId w:val="1004"/>
+          <w:numId w:val="1005"/>
         </w:numPr>
       </w:pPr>
       <w:r>
@@ -3207,7 +3383,7 @@
         <w:pStyle w:val="Compact"/>
         <w:numPr>
           <w:ilvl w:val="0"/>
-          <w:numId w:val="1004"/>
+          <w:numId w:val="1005"/>
         </w:numPr>
       </w:pPr>
       <w:r>
@@ -3228,7 +3404,7 @@
         <w:pStyle w:val="Compact"/>
         <w:numPr>
           <w:ilvl w:val="0"/>
-          <w:numId w:val="1004"/>
+          <w:numId w:val="1005"/>
         </w:numPr>
       </w:pPr>
       <w:r>
@@ -3560,7 +3736,7 @@
         <w:pStyle w:val="Compact"/>
         <w:numPr>
           <w:ilvl w:val="0"/>
-          <w:numId w:val="1005"/>
+          <w:numId w:val="1006"/>
         </w:numPr>
       </w:pPr>
       <w:r>
@@ -3584,7 +3760,7 @@
         <w:pStyle w:val="Compact"/>
         <w:numPr>
           <w:ilvl w:val="0"/>
-          <w:numId w:val="1005"/>
+          <w:numId w:val="1006"/>
         </w:numPr>
       </w:pPr>
       <w:r>
@@ -3635,7 +3811,7 @@
         <w:pStyle w:val="Compact"/>
         <w:numPr>
           <w:ilvl w:val="0"/>
-          <w:numId w:val="1005"/>
+          <w:numId w:val="1006"/>
         </w:numPr>
       </w:pPr>
       <w:r>
@@ -4035,7 +4211,7 @@
         <w:pStyle w:val="Compact"/>
         <w:numPr>
           <w:ilvl w:val="0"/>
-          <w:numId w:val="1006"/>
+          <w:numId w:val="1007"/>
         </w:numPr>
       </w:pPr>
       <w:r>
@@ -4059,7 +4235,7 @@
         <w:pStyle w:val="Compact"/>
         <w:numPr>
           <w:ilvl w:val="0"/>
-          <w:numId w:val="1006"/>
+          <w:numId w:val="1007"/>
         </w:numPr>
       </w:pPr>
       <w:r>
@@ -4385,7 +4561,7 @@
         <w:pStyle w:val="Compact"/>
         <w:numPr>
           <w:ilvl w:val="0"/>
-          <w:numId w:val="1007"/>
+          <w:numId w:val="1008"/>
         </w:numPr>
       </w:pPr>
       <w:r>
@@ -4422,7 +4598,7 @@
         <w:pStyle w:val="Compact"/>
         <w:numPr>
           <w:ilvl w:val="0"/>
-          <w:numId w:val="1007"/>
+          <w:numId w:val="1008"/>
         </w:numPr>
       </w:pPr>
       <w:r>
@@ -4449,7 +4625,7 @@
         <w:pStyle w:val="Compact"/>
         <w:numPr>
           <w:ilvl w:val="0"/>
-          <w:numId w:val="1007"/>
+          <w:numId w:val="1008"/>
         </w:numPr>
       </w:pPr>
       <w:r>
@@ -4831,7 +5007,7 @@
         <w:pStyle w:val="Compact"/>
         <w:numPr>
           <w:ilvl w:val="0"/>
-          <w:numId w:val="1008"/>
+          <w:numId w:val="1009"/>
         </w:numPr>
       </w:pPr>
       <w:r>
@@ -4907,7 +5083,7 @@
         <w:pStyle w:val="Compact"/>
         <w:numPr>
           <w:ilvl w:val="0"/>
-          <w:numId w:val="1008"/>
+          <w:numId w:val="1009"/>
         </w:numPr>
       </w:pPr>
       <w:r>
@@ -4919,7 +5095,7 @@
         <w:pStyle w:val="Compact"/>
         <w:numPr>
           <w:ilvl w:val="0"/>
-          <w:numId w:val="1008"/>
+          <w:numId w:val="1009"/>
         </w:numPr>
       </w:pPr>
       <w:r>
@@ -5337,7 +5513,7 @@
         <w:pStyle w:val="Compact"/>
         <w:numPr>
           <w:ilvl w:val="0"/>
-          <w:numId w:val="1009"/>
+          <w:numId w:val="1010"/>
         </w:numPr>
       </w:pPr>
       <w:r>
@@ -5373,7 +5549,7 @@
         <w:pStyle w:val="Compact"/>
         <w:numPr>
           <w:ilvl w:val="0"/>
-          <w:numId w:val="1009"/>
+          <w:numId w:val="1010"/>
         </w:numPr>
       </w:pPr>
       <w:r>
@@ -5738,7 +5914,7 @@
         <w:pStyle w:val="Compact"/>
         <w:numPr>
           <w:ilvl w:val="0"/>
-          <w:numId w:val="1010"/>
+          <w:numId w:val="1011"/>
         </w:numPr>
       </w:pPr>
       <w:r>
@@ -5762,7 +5938,7 @@
         <w:pStyle w:val="Compact"/>
         <w:numPr>
           <w:ilvl w:val="0"/>
-          <w:numId w:val="1010"/>
+          <w:numId w:val="1011"/>
         </w:numPr>
       </w:pPr>
       <w:r>
@@ -6143,7 +6319,7 @@
         <w:pStyle w:val="Compact"/>
         <w:numPr>
           <w:ilvl w:val="0"/>
-          <w:numId w:val="1011"/>
+          <w:numId w:val="1012"/>
         </w:numPr>
       </w:pPr>
       <w:r>
@@ -6481,7 +6657,7 @@
         <w:pStyle w:val="Compact"/>
         <w:numPr>
           <w:ilvl w:val="0"/>
-          <w:numId w:val="1012"/>
+          <w:numId w:val="1013"/>
         </w:numPr>
       </w:pPr>
       <w:r>
@@ -6505,7 +6681,7 @@
         <w:pStyle w:val="Compact"/>
         <w:numPr>
           <w:ilvl w:val="0"/>
-          <w:numId w:val="1012"/>
+          <w:numId w:val="1013"/>
         </w:numPr>
       </w:pPr>
       <w:r>
@@ -6526,7 +6702,7 @@
         <w:pStyle w:val="Compact"/>
         <w:numPr>
           <w:ilvl w:val="0"/>
-          <w:numId w:val="1012"/>
+          <w:numId w:val="1013"/>
         </w:numPr>
       </w:pPr>
       <w:r>
@@ -6867,7 +7043,7 @@
         <w:pStyle w:val="Compact"/>
         <w:numPr>
           <w:ilvl w:val="0"/>
-          <w:numId w:val="1013"/>
+          <w:numId w:val="1014"/>
         </w:numPr>
       </w:pPr>
       <w:r>
@@ -6891,7 +7067,7 @@
         <w:pStyle w:val="Compact"/>
         <w:numPr>
           <w:ilvl w:val="0"/>
-          <w:numId w:val="1013"/>
+          <w:numId w:val="1014"/>
         </w:numPr>
       </w:pPr>
       <w:r>
@@ -7301,7 +7477,7 @@
         <w:pStyle w:val="Compact"/>
         <w:numPr>
           <w:ilvl w:val="0"/>
-          <w:numId w:val="1014"/>
+          <w:numId w:val="1015"/>
         </w:numPr>
       </w:pPr>
       <w:r>
@@ -7313,7 +7489,7 @@
         <w:pStyle w:val="Compact"/>
         <w:numPr>
           <w:ilvl w:val="0"/>
-          <w:numId w:val="1014"/>
+          <w:numId w:val="1015"/>
         </w:numPr>
       </w:pPr>
       <w:r>
@@ -7354,7 +7530,7 @@
         <w:pStyle w:val="Compact"/>
         <w:numPr>
           <w:ilvl w:val="0"/>
-          <w:numId w:val="1014"/>
+          <w:numId w:val="1015"/>
         </w:numPr>
       </w:pPr>
       <w:r>
@@ -7780,7 +7956,7 @@
         <w:pStyle w:val="Compact"/>
         <w:numPr>
           <w:ilvl w:val="0"/>
-          <w:numId w:val="1015"/>
+          <w:numId w:val="1016"/>
         </w:numPr>
       </w:pPr>
       <w:r>
@@ -7834,7 +8010,7 @@
         <w:pStyle w:val="Compact"/>
         <w:numPr>
           <w:ilvl w:val="0"/>
-          <w:numId w:val="1015"/>
+          <w:numId w:val="1016"/>
         </w:numPr>
       </w:pPr>
       <w:r>
@@ -8204,7 +8380,7 @@
         <w:pStyle w:val="Compact"/>
         <w:numPr>
           <w:ilvl w:val="0"/>
-          <w:numId w:val="1016"/>
+          <w:numId w:val="1017"/>
         </w:numPr>
       </w:pPr>
       <w:r>
@@ -8228,7 +8404,7 @@
         <w:pStyle w:val="Compact"/>
         <w:numPr>
           <w:ilvl w:val="0"/>
-          <w:numId w:val="1016"/>
+          <w:numId w:val="1017"/>
         </w:numPr>
       </w:pPr>
       <w:r>
@@ -8240,7 +8416,7 @@
         <w:pStyle w:val="Compact"/>
         <w:numPr>
           <w:ilvl w:val="0"/>
-          <w:numId w:val="1016"/>
+          <w:numId w:val="1017"/>
         </w:numPr>
       </w:pPr>
       <w:r>
@@ -8261,7 +8437,7 @@
         <w:pStyle w:val="Compact"/>
         <w:numPr>
           <w:ilvl w:val="0"/>
-          <w:numId w:val="1016"/>
+          <w:numId w:val="1017"/>
         </w:numPr>
       </w:pPr>
       <w:r>
@@ -8777,7 +8953,7 @@
         <w:pStyle w:val="Compact"/>
         <w:numPr>
           <w:ilvl w:val="0"/>
-          <w:numId w:val="1017"/>
+          <w:numId w:val="1018"/>
         </w:numPr>
       </w:pPr>
       <w:r>
@@ -8805,7 +8981,7 @@
         <w:pStyle w:val="Compact"/>
         <w:numPr>
           <w:ilvl w:val="0"/>
-          <w:numId w:val="1017"/>
+          <w:numId w:val="1018"/>
         </w:numPr>
       </w:pPr>
       <w:r>
@@ -8856,7 +9032,7 @@
         <w:pStyle w:val="Compact"/>
         <w:numPr>
           <w:ilvl w:val="0"/>
-          <w:numId w:val="1017"/>
+          <w:numId w:val="1018"/>
         </w:numPr>
       </w:pPr>
       <w:r>
@@ -9321,7 +9497,7 @@
         <w:pStyle w:val="Compact"/>
         <w:numPr>
           <w:ilvl w:val="0"/>
-          <w:numId w:val="1018"/>
+          <w:numId w:val="1019"/>
         </w:numPr>
       </w:pPr>
       <w:r>
@@ -9372,7 +9548,7 @@
         <w:pStyle w:val="Compact"/>
         <w:numPr>
           <w:ilvl w:val="0"/>
-          <w:numId w:val="1018"/>
+          <w:numId w:val="1019"/>
         </w:numPr>
       </w:pPr>
       <w:r>
@@ -9695,7 +9871,7 @@
         <w:pStyle w:val="Compact"/>
         <w:numPr>
           <w:ilvl w:val="0"/>
-          <w:numId w:val="1019"/>
+          <w:numId w:val="1020"/>
         </w:numPr>
       </w:pPr>
       <w:r>
@@ -9723,7 +9899,7 @@
         <w:pStyle w:val="Compact"/>
         <w:numPr>
           <w:ilvl w:val="0"/>
-          <w:numId w:val="1019"/>
+          <w:numId w:val="1020"/>
         </w:numPr>
       </w:pPr>
       <w:r>
@@ -10153,7 +10329,7 @@
         <w:pStyle w:val="Compact"/>
         <w:numPr>
           <w:ilvl w:val="0"/>
-          <w:numId w:val="1020"/>
+          <w:numId w:val="1021"/>
         </w:numPr>
       </w:pPr>
       <w:r>
@@ -10680,7 +10856,7 @@
         <w:pStyle w:val="Compact"/>
         <w:numPr>
           <w:ilvl w:val="0"/>
-          <w:numId w:val="1021"/>
+          <w:numId w:val="1022"/>
         </w:numPr>
       </w:pPr>
       <w:r>
@@ -10708,7 +10884,7 @@
         <w:pStyle w:val="Compact"/>
         <w:numPr>
           <w:ilvl w:val="0"/>
-          <w:numId w:val="1021"/>
+          <w:numId w:val="1022"/>
         </w:numPr>
       </w:pPr>
       <w:r>
@@ -11165,7 +11341,7 @@
         <w:pStyle w:val="Compact"/>
         <w:numPr>
           <w:ilvl w:val="0"/>
-          <w:numId w:val="1022"/>
+          <w:numId w:val="1023"/>
         </w:numPr>
       </w:pPr>
       <w:r>
@@ -11222,7 +11398,7 @@
         <w:pStyle w:val="Compact"/>
         <w:numPr>
           <w:ilvl w:val="0"/>
-          <w:numId w:val="1022"/>
+          <w:numId w:val="1023"/>
         </w:numPr>
       </w:pPr>
       <w:r>
@@ -15435,6 +15611,36 @@
     </w:lvlOverride>
   </w:num>
   <w:num w:numId="1022">
+    <w:abstractNumId w:val="99411"/>
+    <w:lvlOverride w:ilvl="0">
+      <w:startOverride w:val="1"/>
+    </w:lvlOverride>
+    <w:lvlOverride w:ilvl="1">
+      <w:startOverride w:val="1"/>
+    </w:lvlOverride>
+    <w:lvlOverride w:ilvl="2">
+      <w:startOverride w:val="1"/>
+    </w:lvlOverride>
+    <w:lvlOverride w:ilvl="3">
+      <w:startOverride w:val="1"/>
+    </w:lvlOverride>
+    <w:lvlOverride w:ilvl="4">
+      <w:startOverride w:val="1"/>
+    </w:lvlOverride>
+    <w:lvlOverride w:ilvl="5">
+      <w:startOverride w:val="1"/>
+    </w:lvlOverride>
+    <w:lvlOverride w:ilvl="6">
+      <w:startOverride w:val="1"/>
+    </w:lvlOverride>
+    <w:lvlOverride w:ilvl="7">
+      <w:startOverride w:val="1"/>
+    </w:lvlOverride>
+    <w:lvlOverride w:ilvl="8">
+      <w:startOverride w:val="1"/>
+    </w:lvlOverride>
+  </w:num>
+  <w:num w:numId="1023">
     <w:abstractNumId w:val="99411"/>
     <w:lvlOverride w:ilvl="0">
       <w:startOverride w:val="1"/>

</xml_diff>